<commit_message>
Align portfolio with AI Lab scope and feature Eventer
</commit_message>
<xml_diff>
--- a/docs/resume/alexander-aidun-resume.docx
+++ b/docs/resume/alexander-aidun-resume.docx
@@ -173,7 +173,7 @@
           <w:color w:val="5C6878"/>
           <w:sz w:val="17"/>
         </w:rPr>
-        <w:t xml:space="preserve"> | AI Adoption Manager</w:t>
+        <w:t xml:space="preserve"> | AI Lab &amp; Adoption Manager</w:t>
       </w:r>
       <w:r>
         <w:tab/>
@@ -199,7 +199,7 @@
           <w:color w:val="335CFF"/>
           <w:sz w:val="18"/>
         </w:rPr>
-        <w:t xml:space="preserve">OPERATE  </w:t>
+        <w:t xml:space="preserve">BUILD  </w:t>
       </w:r>
       <w:r>
         <w:rPr>
@@ -207,7 +207,7 @@
           <w:color w:val="14213D"/>
           <w:sz w:val="18"/>
         </w:rPr>
-        <w:t>ChatGPT and Claude for 1,500 employees, including functional and cost operations.</w:t>
+        <w:t>Design and drive internal AI tools, including a Slack-based coding-agent rollout across departments.</w:t>
       </w:r>
     </w:p>
     <w:p>
@@ -221,7 +221,7 @@
           <w:color w:val="335CFF"/>
           <w:sz w:val="18"/>
         </w:rPr>
-        <w:t xml:space="preserve">OWN  </w:t>
+        <w:t xml:space="preserve">OPERATE  </w:t>
       </w:r>
       <w:r>
         <w:rPr>
@@ -229,7 +229,7 @@
           <w:color w:val="14213D"/>
           <w:sz w:val="18"/>
         </w:rPr>
-        <w:t>AI Agent, AI Learning, LibreChat, and Slack automations across product, guidance, and adoption.</w:t>
+        <w:t>Help keep costs in line while building homegrown systems for governed AI spend and approvals.</w:t>
       </w:r>
     </w:p>
     <w:p>
@@ -251,7 +251,7 @@
           <w:color w:val="14213D"/>
           <w:sz w:val="18"/>
         </w:rPr>
-        <w:t>Publish 2-3 how-to articles weekly, lead AI Guides, and scope executive AI use cases.</w:t>
+        <w:t>Led the first hybrid Growth cohort, built a reusable workshop tool, and helped launch 19 AI Guides.</w:t>
       </w:r>
     </w:p>
     <w:p>
@@ -307,7 +307,7 @@
           <w:color w:val="14213D"/>
           <w:sz w:val="18"/>
         </w:rPr>
-        <w:t>Four AI initiatives: AI Agent, MCP Server, AI SQL Functions, and Data Analyst chatbot.</w:t>
+        <w:t>AI PM from Apr 2025: scoped and drove AI Agent, MCP, AI SQL functions, and analyst chatbot initiatives.</w:t>
       </w:r>
     </w:p>
     <w:p>
@@ -672,7 +672,7 @@
           <w:color w:val="335CFF"/>
           <w:sz w:val="18"/>
         </w:rPr>
-        <w:t xml:space="preserve">CERTIFYFAST  </w:t>
+        <w:t xml:space="preserve">EVENTER  </w:t>
       </w:r>
       <w:r>
         <w:rPr>
@@ -680,7 +680,7 @@
           <w:color w:val="14213D"/>
           <w:sz w:val="18"/>
         </w:rPr>
-        <w:t>Source-grounded certification workflow with traceability for expert review.</w:t>
+        <w:t>Open-source event-planning plugin: 12 skills, local records, human approvals, and synthetic evaluation.</w:t>
       </w:r>
     </w:p>
     <w:p>

</xml_diff>